<commit_message>
Modifica Word sobre delito y denuncia
</commit_message>
<xml_diff>
--- a/templates/disposiciones/archivo/8591-2024 ARCHIVO SUPLANTACION SI DECLARO NO HAY PERJUICIO - INCONCURRENCIA.docx
+++ b/templates/disposiciones/archivo/8591-2024 ARCHIVO SUPLANTACION SI DECLARO NO HAY PERJUICIO - INCONCURRENCIA.docx
@@ -66,7 +66,6 @@
               </w:rPr>
               <w:t>{</w:t>
             </w:r>
-            <w:proofErr w:type="spellStart"/>
             <w:r>
               <w:rPr>
                 <w:rFonts w:ascii="Arial Narrow" w:eastAsia="Times New Roman" w:hAnsi="Arial Narrow"/>
@@ -83,17 +82,7 @@
                 <w:bCs/>
                 <w:lang w:eastAsia="ar-SA"/>
               </w:rPr>
-              <w:t>arpeta_fiscal</w:t>
-            </w:r>
-            <w:proofErr w:type="spellEnd"/>
-            <w:r>
-              <w:rPr>
-                <w:rFonts w:ascii="Arial Narrow" w:eastAsia="Times New Roman" w:hAnsi="Arial Narrow"/>
-                <w:b/>
-                <w:bCs/>
-                <w:lang w:eastAsia="ar-SA"/>
-              </w:rPr>
-              <w:t>}</w:t>
+              <w:t>arpeta_fiscal}</w:t>
             </w:r>
           </w:p>
         </w:tc>
@@ -466,9 +455,8 @@
           <w:szCs w:val="21"/>
           <w:u w:val="single"/>
         </w:rPr>
-        <w:t>{</w:t>
-      </w:r>
-      <w:proofErr w:type="spellStart"/>
+        <w:t>{D</w:t>
+      </w:r>
       <w:r>
         <w:rPr>
           <w:rFonts w:ascii="Arial Narrow" w:hAnsi="Arial Narrow"/>
@@ -477,7 +465,7 @@
           <w:szCs w:val="21"/>
           <w:u w:val="single"/>
         </w:rPr>
-        <w:t>D</w:t>
+        <w:t>isposici</w:t>
       </w:r>
       <w:r>
         <w:rPr>
@@ -487,7 +475,7 @@
           <w:szCs w:val="21"/>
           <w:u w:val="single"/>
         </w:rPr>
-        <w:t>isposici</w:t>
+        <w:t>ó</w:t>
       </w:r>
       <w:r>
         <w:rPr>
@@ -497,7 +485,7 @@
           <w:szCs w:val="21"/>
           <w:u w:val="single"/>
         </w:rPr>
-        <w:t>ó</w:t>
+        <w:t>n_</w:t>
       </w:r>
       <w:r>
         <w:rPr>
@@ -507,19 +495,8 @@
           <w:szCs w:val="21"/>
           <w:u w:val="single"/>
         </w:rPr>
-        <w:t>n_</w:t>
-      </w:r>
-      <w:r>
-        <w:rPr>
-          <w:rFonts w:ascii="Arial Narrow" w:hAnsi="Arial Narrow"/>
-          <w:b/>
-          <w:sz w:val="21"/>
-          <w:szCs w:val="21"/>
-          <w:u w:val="single"/>
-        </w:rPr>
         <w:t>Número</w:t>
       </w:r>
-      <w:proofErr w:type="spellEnd"/>
       <w:r>
         <w:rPr>
           <w:rFonts w:ascii="Arial Narrow" w:hAnsi="Arial Narrow"/>
@@ -575,7 +552,6 @@
         </w:rPr>
         <w:t>{</w:t>
       </w:r>
-      <w:proofErr w:type="spellStart"/>
       <w:r>
         <w:rPr>
           <w:rFonts w:ascii="Arial Narrow" w:hAnsi="Arial Narrow"/>
@@ -621,7 +597,6 @@
         </w:rPr>
         <w:t>n</w:t>
       </w:r>
-      <w:proofErr w:type="spellEnd"/>
       <w:r>
         <w:rPr>
           <w:rFonts w:ascii="Arial Narrow" w:hAnsi="Arial Narrow"/>
@@ -769,7 +744,6 @@
         </w:rPr>
         <w:t>{</w:t>
       </w:r>
-      <w:proofErr w:type="spellStart"/>
       <w:r>
         <w:rPr>
           <w:rFonts w:ascii="Arial Narrow" w:hAnsi="Arial Narrow"/>
@@ -794,7 +768,6 @@
         </w:rPr>
         <w:t>Número</w:t>
       </w:r>
-      <w:proofErr w:type="spellEnd"/>
       <w:r>
         <w:rPr>
           <w:rFonts w:ascii="Arial Narrow" w:hAnsi="Arial Narrow"/>
@@ -819,7 +792,6 @@
         </w:rPr>
         <w:t xml:space="preserve"> {</w:t>
       </w:r>
-      <w:proofErr w:type="spellStart"/>
       <w:r>
         <w:rPr>
           <w:rFonts w:ascii="Arial Narrow" w:hAnsi="Arial Narrow"/>
@@ -866,125 +838,118 @@
           <w:sz w:val="21"/>
           <w:szCs w:val="21"/>
         </w:rPr>
-        <w:t>n</w:t>
-      </w:r>
-      <w:proofErr w:type="spellEnd"/>
-      <w:r>
-        <w:rPr>
-          <w:rFonts w:ascii="Arial Narrow" w:hAnsi="Arial Narrow"/>
-          <w:sz w:val="21"/>
-          <w:szCs w:val="21"/>
+        <w:t>n}</w:t>
+      </w:r>
+      <w:r>
+        <w:rPr>
+          <w:rFonts w:ascii="Arial Narrow" w:hAnsi="Arial Narrow"/>
+          <w:sz w:val="21"/>
+          <w:szCs w:val="21"/>
+        </w:rPr>
+        <w:t>, remitido por la</w:t>
+      </w:r>
+      <w:r>
+        <w:rPr>
+          <w:rFonts w:ascii="Arial Narrow" w:hAnsi="Arial Narrow"/>
+          <w:sz w:val="21"/>
+          <w:szCs w:val="21"/>
+        </w:rPr>
+        <w:t xml:space="preserve"> {</w:t>
+      </w:r>
+      <w:r>
+        <w:rPr>
+          <w:rFonts w:ascii="Arial Narrow" w:hAnsi="Arial Narrow"/>
+          <w:sz w:val="21"/>
+          <w:szCs w:val="21"/>
+        </w:rPr>
+        <w:t>D</w:t>
+      </w:r>
+      <w:r>
+        <w:rPr>
+          <w:rFonts w:ascii="Arial Narrow" w:hAnsi="Arial Narrow"/>
+          <w:sz w:val="21"/>
+          <w:szCs w:val="21"/>
+        </w:rPr>
+        <w:t>ependencia_policial}</w:t>
+      </w:r>
+      <w:r>
+        <w:rPr>
+          <w:rFonts w:ascii="Arial Narrow" w:hAnsi="Arial Narrow"/>
+          <w:sz w:val="21"/>
+          <w:szCs w:val="21"/>
+        </w:rPr>
+        <w:t>, que contiene la investigación seguida contra</w:t>
+      </w:r>
+      <w:r>
+        <w:rPr>
+          <w:rFonts w:ascii="Arial Narrow" w:eastAsia="SimSun" w:hAnsi="Arial Narrow"/>
+          <w:b/>
+          <w:bCs/>
+          <w:kern w:val="2"/>
+          <w:sz w:val="21"/>
+          <w:szCs w:val="21"/>
+          <w:lang w:eastAsia="hi-IN" w:bidi="hi-IN"/>
+        </w:rPr>
+        <w:t xml:space="preserve"> </w:t>
+      </w:r>
+      <w:r>
+        <w:rPr>
+          <w:rFonts w:ascii="Arial Narrow" w:eastAsia="SimSun" w:hAnsi="Arial Narrow"/>
+          <w:b/>
+          <w:bCs/>
+          <w:kern w:val="2"/>
+          <w:sz w:val="21"/>
+          <w:szCs w:val="21"/>
+          <w:lang w:eastAsia="hi-IN" w:bidi="hi-IN"/>
+        </w:rPr>
+        <w:t>{Denunciado}</w:t>
+      </w:r>
+      <w:r>
+        <w:rPr>
+          <w:rFonts w:ascii="Arial Narrow" w:eastAsia="Times New Roman" w:hAnsi="Arial Narrow"/>
+          <w:b/>
+          <w:bCs/>
+          <w:sz w:val="21"/>
+          <w:szCs w:val="21"/>
+          <w:lang w:eastAsia="ar-SA"/>
+        </w:rPr>
+        <w:t xml:space="preserve">, </w:t>
+      </w:r>
+      <w:r>
+        <w:rPr>
+          <w:rFonts w:ascii="Arial Narrow" w:eastAsia="Times New Roman" w:hAnsi="Arial Narrow"/>
+          <w:sz w:val="21"/>
+          <w:szCs w:val="21"/>
+          <w:lang w:eastAsia="es-ES"/>
+        </w:rPr>
+        <w:t>por la presunta comisión del delito de</w:t>
+      </w:r>
+      <w:r>
+        <w:rPr>
+          <w:rFonts w:ascii="Arial Narrow" w:eastAsia="Times New Roman" w:hAnsi="Arial Narrow"/>
+          <w:sz w:val="21"/>
+          <w:szCs w:val="21"/>
+          <w:lang w:eastAsia="es-ES"/>
+        </w:rPr>
+        <w:t xml:space="preserve"> {</w:t>
+      </w:r>
+      <w:r>
+        <w:rPr>
+          <w:rFonts w:ascii="Arial Narrow" w:eastAsia="Times New Roman" w:hAnsi="Arial Narrow"/>
+          <w:sz w:val="21"/>
+          <w:szCs w:val="21"/>
+          <w:lang w:eastAsia="es-ES"/>
+        </w:rPr>
+        <w:t>Delito</w:t>
+      </w:r>
+      <w:r>
+        <w:rPr>
+          <w:rFonts w:ascii="Arial Narrow" w:eastAsia="Times New Roman" w:hAnsi="Arial Narrow"/>
+          <w:sz w:val="21"/>
+          <w:szCs w:val="21"/>
+          <w:lang w:eastAsia="es-ES"/>
         </w:rPr>
         <w:t>}</w:t>
-      </w:r>
-      <w:r>
-        <w:rPr>
-          <w:rFonts w:ascii="Arial Narrow" w:hAnsi="Arial Narrow"/>
-          <w:sz w:val="21"/>
-          <w:szCs w:val="21"/>
-        </w:rPr>
-        <w:t>, remitido por la</w:t>
-      </w:r>
-      <w:r>
-        <w:rPr>
-          <w:rFonts w:ascii="Arial Narrow" w:hAnsi="Arial Narrow"/>
-          <w:sz w:val="21"/>
-          <w:szCs w:val="21"/>
-        </w:rPr>
-        <w:t xml:space="preserve"> {</w:t>
-      </w:r>
-      <w:proofErr w:type="spellStart"/>
-      <w:r>
-        <w:rPr>
-          <w:rFonts w:ascii="Arial Narrow" w:hAnsi="Arial Narrow"/>
-          <w:sz w:val="21"/>
-          <w:szCs w:val="21"/>
-        </w:rPr>
-        <w:t>D</w:t>
-      </w:r>
-      <w:r>
-        <w:rPr>
-          <w:rFonts w:ascii="Arial Narrow" w:hAnsi="Arial Narrow"/>
-          <w:sz w:val="21"/>
-          <w:szCs w:val="21"/>
-        </w:rPr>
-        <w:t>ependencia_policial</w:t>
-      </w:r>
-      <w:proofErr w:type="spellEnd"/>
-      <w:r>
-        <w:rPr>
-          <w:rFonts w:ascii="Arial Narrow" w:hAnsi="Arial Narrow"/>
-          <w:sz w:val="21"/>
-          <w:szCs w:val="21"/>
-        </w:rPr>
-        <w:t>}</w:t>
-      </w:r>
-      <w:r>
-        <w:rPr>
-          <w:rFonts w:ascii="Arial Narrow" w:hAnsi="Arial Narrow"/>
-          <w:sz w:val="21"/>
-          <w:szCs w:val="21"/>
-        </w:rPr>
-        <w:t>, que contiene la investigación seguida contra</w:t>
-      </w:r>
-      <w:r>
-        <w:rPr>
-          <w:rFonts w:ascii="Arial Narrow" w:eastAsia="SimSun" w:hAnsi="Arial Narrow"/>
-          <w:b/>
-          <w:bCs/>
-          <w:kern w:val="2"/>
-          <w:sz w:val="21"/>
-          <w:szCs w:val="21"/>
-          <w:lang w:eastAsia="hi-IN" w:bidi="hi-IN"/>
-        </w:rPr>
-        <w:t xml:space="preserve"> los que resulten responsables</w:t>
-      </w:r>
-      <w:r>
-        <w:rPr>
-          <w:rFonts w:ascii="Arial Narrow" w:eastAsia="Times New Roman" w:hAnsi="Arial Narrow"/>
-          <w:b/>
-          <w:bCs/>
-          <w:sz w:val="21"/>
-          <w:szCs w:val="21"/>
-          <w:lang w:eastAsia="ar-SA"/>
-        </w:rPr>
-        <w:t xml:space="preserve">, </w:t>
-      </w:r>
-      <w:r>
-        <w:rPr>
-          <w:rFonts w:ascii="Arial Narrow" w:eastAsia="Times New Roman" w:hAnsi="Arial Narrow"/>
-          <w:sz w:val="21"/>
-          <w:szCs w:val="21"/>
-          <w:lang w:eastAsia="es-ES"/>
-        </w:rPr>
-        <w:t>por la presunta comisión del delito de</w:t>
-      </w:r>
-      <w:r>
-        <w:rPr>
-          <w:rFonts w:ascii="Arial Narrow" w:eastAsia="Times New Roman" w:hAnsi="Arial Narrow"/>
-          <w:sz w:val="21"/>
-          <w:szCs w:val="21"/>
-          <w:lang w:eastAsia="es-ES"/>
-        </w:rPr>
-        <w:t xml:space="preserve"> {</w:t>
-      </w:r>
-      <w:r>
-        <w:rPr>
-          <w:rFonts w:ascii="Arial Narrow" w:eastAsia="Times New Roman" w:hAnsi="Arial Narrow"/>
-          <w:sz w:val="21"/>
-          <w:szCs w:val="21"/>
-          <w:lang w:eastAsia="es-ES"/>
-        </w:rPr>
-        <w:t>D</w:t>
-      </w:r>
-      <w:r>
-        <w:rPr>
-          <w:rFonts w:ascii="Arial Narrow" w:eastAsia="Times New Roman" w:hAnsi="Arial Narrow"/>
-          <w:sz w:val="21"/>
-          <w:szCs w:val="21"/>
-          <w:lang w:eastAsia="es-ES"/>
-        </w:rPr>
-        <w:t>enunciado}</w:t>
       </w:r>
       <w:r>
         <w:rPr>
@@ -1327,6 +1292,7 @@
             <w:pPr>
               <w:spacing w:after="0" w:line="240" w:lineRule="auto"/>
               <w:ind w:left="128" w:right="135"/>
+              <w:jc w:val="center"/>
               <w:rPr>
                 <w:rFonts w:ascii="Arial Narrow" w:hAnsi="Arial Narrow"/>
                 <w:b/>
@@ -1349,7 +1315,6 @@
               </w:rPr>
               <w:t>{</w:t>
             </w:r>
-            <w:proofErr w:type="spellStart"/>
             <w:r>
               <w:rPr>
                 <w:rStyle w:val="Fuentedeprrafopredeter1"/>
@@ -1386,7 +1351,6 @@
               </w:rPr>
               <w:t>_de_ley</w:t>
             </w:r>
-            <w:proofErr w:type="spellEnd"/>
             <w:r>
               <w:rPr>
                 <w:rStyle w:val="Fuentedeprrafopredeter1"/>
@@ -1424,8 +1388,6 @@
               <w:ind w:left="128" w:right="135"/>
               <w:rPr>
                 <w:rFonts w:ascii="Arial Narrow" w:eastAsia="Garamond" w:hAnsi="Arial Narrow"/>
-                <w:i/>
-                <w:iCs/>
                 <w:sz w:val="20"/>
                 <w:szCs w:val="20"/>
                 <w:lang w:val="es-MX"/>
@@ -1434,28 +1396,17 @@
             <w:r>
               <w:rPr>
                 <w:rFonts w:ascii="Arial Narrow" w:eastAsia="Garamond" w:hAnsi="Arial Narrow"/>
-                <w:b/>
-                <w:bCs/>
-                <w:i/>
-                <w:iCs/>
                 <w:sz w:val="20"/>
                 <w:szCs w:val="20"/>
-                <w:u w:val="single"/>
                 <w:lang w:val="es-MX"/>
               </w:rPr>
               <w:t>{</w:t>
             </w:r>
-            <w:proofErr w:type="spellStart"/>
             <w:r>
               <w:rPr>
                 <w:rFonts w:ascii="Arial Narrow" w:eastAsia="Garamond" w:hAnsi="Arial Narrow"/>
-                <w:b/>
-                <w:bCs/>
-                <w:i/>
-                <w:iCs/>
                 <w:sz w:val="20"/>
                 <w:szCs w:val="20"/>
-                <w:u w:val="single"/>
                 <w:lang w:val="es-MX"/>
               </w:rPr>
               <w:t>C</w:t>
@@ -1463,13 +1414,8 @@
             <w:r>
               <w:rPr>
                 <w:rFonts w:ascii="Arial Narrow" w:eastAsia="Garamond" w:hAnsi="Arial Narrow"/>
-                <w:b/>
-                <w:bCs/>
-                <w:i/>
-                <w:iCs/>
                 <w:sz w:val="20"/>
                 <w:szCs w:val="20"/>
-                <w:u w:val="single"/>
                 <w:lang w:val="es-MX"/>
               </w:rPr>
               <w:t>ontenido_</w:t>
@@ -1477,13 +1423,8 @@
             <w:r>
               <w:rPr>
                 <w:rFonts w:ascii="Arial Narrow" w:eastAsia="Garamond" w:hAnsi="Arial Narrow"/>
-                <w:b/>
-                <w:bCs/>
-                <w:i/>
-                <w:iCs/>
                 <w:sz w:val="20"/>
                 <w:szCs w:val="20"/>
-                <w:u w:val="single"/>
                 <w:lang w:val="es-MX"/>
               </w:rPr>
               <w:t>del_</w:t>
@@ -1491,96 +1432,16 @@
             <w:r>
               <w:rPr>
                 <w:rFonts w:ascii="Arial Narrow" w:eastAsia="Garamond" w:hAnsi="Arial Narrow"/>
-                <w:b/>
-                <w:bCs/>
-                <w:i/>
-                <w:iCs/>
                 <w:sz w:val="20"/>
                 <w:szCs w:val="20"/>
-                <w:u w:val="single"/>
                 <w:lang w:val="es-MX"/>
               </w:rPr>
-              <w:t>articulo</w:t>
-            </w:r>
-            <w:proofErr w:type="spellEnd"/>
-            <w:r>
-              <w:rPr>
-                <w:rFonts w:ascii="Arial Narrow" w:eastAsia="Garamond" w:hAnsi="Arial Narrow"/>
-                <w:b/>
-                <w:bCs/>
-                <w:i/>
-                <w:iCs/>
-                <w:sz w:val="20"/>
-                <w:szCs w:val="20"/>
-                <w:u w:val="single"/>
-                <w:lang w:val="es-MX"/>
-              </w:rPr>
-              <w:t>}</w:t>
+              <w:t>articulo}</w:t>
             </w:r>
           </w:p>
         </w:tc>
       </w:tr>
     </w:tbl>
-    <w:p>
-      <w:pPr>
-        <w:suppressAutoHyphens/>
-        <w:spacing w:after="0" w:line="276" w:lineRule="auto"/>
-        <w:rPr>
-          <w:rFonts w:ascii="Arial Narrow" w:eastAsia="Times New Roman" w:hAnsi="Arial Narrow"/>
-          <w:b/>
-          <w:bCs/>
-          <w:sz w:val="21"/>
-          <w:szCs w:val="21"/>
-          <w:u w:val="single"/>
-          <w:lang w:eastAsia="ar-SA"/>
-        </w:rPr>
-      </w:pPr>
-    </w:p>
-    <w:p>
-      <w:pPr>
-        <w:suppressAutoHyphens/>
-        <w:spacing w:after="0" w:line="276" w:lineRule="auto"/>
-        <w:rPr>
-          <w:rFonts w:ascii="Arial Narrow" w:eastAsia="Times New Roman" w:hAnsi="Arial Narrow"/>
-          <w:b/>
-          <w:bCs/>
-          <w:sz w:val="21"/>
-          <w:szCs w:val="21"/>
-          <w:u w:val="single"/>
-          <w:lang w:eastAsia="ar-SA"/>
-        </w:rPr>
-      </w:pPr>
-    </w:p>
-    <w:p>
-      <w:pPr>
-        <w:suppressAutoHyphens/>
-        <w:spacing w:after="0" w:line="276" w:lineRule="auto"/>
-        <w:rPr>
-          <w:rFonts w:ascii="Arial Narrow" w:eastAsia="Times New Roman" w:hAnsi="Arial Narrow"/>
-          <w:b/>
-          <w:bCs/>
-          <w:sz w:val="21"/>
-          <w:szCs w:val="21"/>
-          <w:u w:val="single"/>
-          <w:lang w:eastAsia="ar-SA"/>
-        </w:rPr>
-      </w:pPr>
-    </w:p>
-    <w:p>
-      <w:pPr>
-        <w:suppressAutoHyphens/>
-        <w:spacing w:after="0" w:line="276" w:lineRule="auto"/>
-        <w:rPr>
-          <w:rFonts w:ascii="Arial Narrow" w:eastAsia="Times New Roman" w:hAnsi="Arial Narrow"/>
-          <w:b/>
-          <w:bCs/>
-          <w:sz w:val="21"/>
-          <w:szCs w:val="21"/>
-          <w:u w:val="single"/>
-          <w:lang w:eastAsia="ar-SA"/>
-        </w:rPr>
-      </w:pPr>
-    </w:p>
     <w:p>
       <w:pPr>
         <w:suppressAutoHyphens/>
@@ -1697,51 +1558,7 @@
           <w:szCs w:val="21"/>
           <w:lang w:eastAsia="ar-SA"/>
         </w:rPr>
-        <w:t xml:space="preserve">  De conformidad con lo previsto en el artículo 11º del D. </w:t>
-      </w:r>
-      <w:proofErr w:type="spellStart"/>
-      <w:r>
-        <w:rPr>
-          <w:rFonts w:ascii="Arial Narrow" w:eastAsia="Times New Roman" w:hAnsi="Arial Narrow"/>
-          <w:iCs/>
-          <w:sz w:val="21"/>
-          <w:szCs w:val="21"/>
-          <w:lang w:eastAsia="ar-SA"/>
-        </w:rPr>
-        <w:t>Leg</w:t>
-      </w:r>
-      <w:proofErr w:type="spellEnd"/>
-      <w:r>
-        <w:rPr>
-          <w:rFonts w:ascii="Arial Narrow" w:eastAsia="Times New Roman" w:hAnsi="Arial Narrow"/>
-          <w:iCs/>
-          <w:sz w:val="21"/>
-          <w:szCs w:val="21"/>
-          <w:lang w:eastAsia="ar-SA"/>
-        </w:rPr>
-        <w:t xml:space="preserve">. </w:t>
-      </w:r>
-      <w:proofErr w:type="spellStart"/>
-      <w:r>
-        <w:rPr>
-          <w:rFonts w:ascii="Arial Narrow" w:eastAsia="Times New Roman" w:hAnsi="Arial Narrow"/>
-          <w:iCs/>
-          <w:sz w:val="21"/>
-          <w:szCs w:val="21"/>
-          <w:lang w:eastAsia="ar-SA"/>
-        </w:rPr>
-        <w:t>Nº</w:t>
-      </w:r>
-      <w:proofErr w:type="spellEnd"/>
-      <w:r>
-        <w:rPr>
-          <w:rFonts w:ascii="Arial Narrow" w:eastAsia="Times New Roman" w:hAnsi="Arial Narrow"/>
-          <w:iCs/>
-          <w:sz w:val="21"/>
-          <w:szCs w:val="21"/>
-          <w:lang w:eastAsia="ar-SA"/>
-        </w:rPr>
-        <w:t xml:space="preserve"> 052, el Ministerio Público posee la titularidad del ejercicio de la acción penal pública, posee la potestad discrecional de valorar, si un determinado hecho tiene trascendencia jurídica y de dar inicio a la investigación del delito, como se desprende del artículo 94º, inciso 2º de la L.O.M.P., la cual, tiene por finalidad la práctica de actos de investigación, que se consideren indispensables, para conseguir los indicios delictivos mínimos, que permitan promover la acción penal pública, esto es, reunir la prueba que se estime suficiente, para proceder a formalizar o contrario sensu, archivar dicha investigación si no se ha acopiado la prueba suficiente.</w:t>
+        <w:t xml:space="preserve">  De conformidad con lo previsto en el artículo 11º del D. Leg. Nº 052, el Ministerio Público posee la titularidad del ejercicio de la acción penal pública, posee la potestad discrecional de valorar, si un determinado hecho tiene trascendencia jurídica y de dar inicio a la investigación del delito, como se desprende del artículo 94º, inciso 2º de la L.O.M.P., la cual, tiene por finalidad la práctica de actos de investigación, que se consideren indispensables, para conseguir los indicios delictivos mínimos, que permitan promover la acción penal pública, esto es, reunir la prueba que se estime suficiente, para proceder a formalizar o contrario sensu, archivar dicha investigación si no se ha acopiado la prueba suficiente.</w:t>
       </w:r>
     </w:p>
     <w:p>
@@ -1788,7 +1605,6 @@
           <w:szCs w:val="21"/>
           <w:lang w:eastAsia="ar-SA"/>
         </w:rPr>
-        <w:lastRenderedPageBreak/>
         <w:t xml:space="preserve">3.2.   </w:t>
       </w:r>
       <w:r>
@@ -1889,6 +1705,7 @@
           <w:szCs w:val="21"/>
           <w:lang w:eastAsia="es-PE"/>
         </w:rPr>
+        <w:lastRenderedPageBreak/>
         <w:t xml:space="preserve">3.3. </w:t>
       </w:r>
       <w:r>
@@ -2010,79 +1827,7 @@
           <w:szCs w:val="21"/>
           <w:lang w:eastAsia="es-ES"/>
         </w:rPr>
-        <w:t xml:space="preserve">, expresa “El art. 334.1 NCPP establece las causales por las que el fiscal, luego de recibir la denuncia o culminar la </w:t>
-      </w:r>
-      <w:proofErr w:type="spellStart"/>
-      <w:r>
-        <w:rPr>
-          <w:rFonts w:ascii="Arial Narrow" w:eastAsia="Batang" w:hAnsi="Arial Narrow"/>
-          <w:color w:val="000000"/>
-          <w:kern w:val="3"/>
-          <w:sz w:val="21"/>
-          <w:szCs w:val="21"/>
-          <w:lang w:eastAsia="es-ES"/>
-        </w:rPr>
-        <w:t>subfase</w:t>
-      </w:r>
-      <w:proofErr w:type="spellEnd"/>
-      <w:r>
-        <w:rPr>
-          <w:rFonts w:ascii="Arial Narrow" w:eastAsia="Batang" w:hAnsi="Arial Narrow"/>
-          <w:color w:val="000000"/>
-          <w:kern w:val="3"/>
-          <w:sz w:val="21"/>
-          <w:szCs w:val="21"/>
-          <w:lang w:eastAsia="es-ES"/>
-        </w:rPr>
-        <w:t xml:space="preserve"> de diligencias preliminares, puede emitir una disposición de archivo. Estas son: (i) que el hecho no constituye delito o no es justiciable penalmente; (</w:t>
-      </w:r>
-      <w:proofErr w:type="spellStart"/>
-      <w:r>
-        <w:rPr>
-          <w:rFonts w:ascii="Arial Narrow" w:eastAsia="Batang" w:hAnsi="Arial Narrow"/>
-          <w:color w:val="000000"/>
-          <w:kern w:val="3"/>
-          <w:sz w:val="21"/>
-          <w:szCs w:val="21"/>
-          <w:lang w:eastAsia="es-ES"/>
-        </w:rPr>
-        <w:t>ii</w:t>
-      </w:r>
-      <w:proofErr w:type="spellEnd"/>
-      <w:r>
-        <w:rPr>
-          <w:rFonts w:ascii="Arial Narrow" w:eastAsia="Batang" w:hAnsi="Arial Narrow"/>
-          <w:color w:val="000000"/>
-          <w:kern w:val="3"/>
-          <w:sz w:val="21"/>
-          <w:szCs w:val="21"/>
-          <w:lang w:eastAsia="es-ES"/>
-        </w:rPr>
-        <w:t>) que se presenten causas de extinción de la acción penal o no se individualice -con sus nombres y apellidos completos- al denunciado o investigado: y, (</w:t>
-      </w:r>
-      <w:proofErr w:type="spellStart"/>
-      <w:r>
-        <w:rPr>
-          <w:rFonts w:ascii="Arial Narrow" w:eastAsia="Batang" w:hAnsi="Arial Narrow"/>
-          <w:color w:val="000000"/>
-          <w:kern w:val="3"/>
-          <w:sz w:val="21"/>
-          <w:szCs w:val="21"/>
-          <w:lang w:eastAsia="es-ES"/>
-        </w:rPr>
-        <w:t>iii</w:t>
-      </w:r>
-      <w:proofErr w:type="spellEnd"/>
-      <w:r>
-        <w:rPr>
-          <w:rFonts w:ascii="Arial Narrow" w:eastAsia="Batang" w:hAnsi="Arial Narrow"/>
-          <w:color w:val="000000"/>
-          <w:kern w:val="3"/>
-          <w:sz w:val="21"/>
-          <w:szCs w:val="21"/>
-          <w:lang w:eastAsia="es-ES"/>
-        </w:rPr>
-        <w:t xml:space="preserve">) que </w:t>
+        <w:t xml:space="preserve">, expresa “El art. 334.1 NCPP establece las causales por las que el fiscal, luego de recibir la denuncia o culminar la subfase de diligencias preliminares, puede emitir una disposición de archivo. Estas son: (i) que el hecho no constituye delito o no es justiciable penalmente; (ii) que se presenten causas de extinción de la acción penal o no se individualice -con sus nombres y apellidos completos- al denunciado o investigado: y, (iii) que </w:t>
       </w:r>
       <w:r>
         <w:rPr>
@@ -2371,7 +2116,6 @@
           <w:szCs w:val="21"/>
           <w:lang w:eastAsia="es-ES"/>
         </w:rPr>
-        <w:lastRenderedPageBreak/>
         <w:t xml:space="preserve">4.1.   </w:t>
       </w:r>
       <w:r>
@@ -2383,7 +2127,6 @@
         </w:rPr>
         <w:t>En el caso de autos, si bien es función del Ministerio Público ejercer su facultad persecutoria del delito como titular del ejercicio público de la acción penal, ante una “</w:t>
       </w:r>
-      <w:proofErr w:type="spellStart"/>
       <w:r>
         <w:rPr>
           <w:rFonts w:ascii="Arial Narrow" w:eastAsia="Times New Roman" w:hAnsi="Arial Narrow"/>
@@ -2393,41 +2136,26 @@
           <w:szCs w:val="21"/>
           <w:lang w:eastAsia="es-ES"/>
         </w:rPr>
-        <w:t>notitia</w:t>
-      </w:r>
-      <w:proofErr w:type="spellEnd"/>
-      <w:r>
-        <w:rPr>
-          <w:rFonts w:ascii="Arial Narrow" w:eastAsia="Times New Roman" w:hAnsi="Arial Narrow"/>
-          <w:i/>
-          <w:iCs/>
-          <w:sz w:val="21"/>
-          <w:szCs w:val="21"/>
-          <w:lang w:eastAsia="es-ES"/>
-        </w:rPr>
-        <w:t xml:space="preserve"> </w:t>
-      </w:r>
-      <w:proofErr w:type="spellStart"/>
-      <w:r>
-        <w:rPr>
-          <w:rFonts w:ascii="Arial Narrow" w:eastAsia="Times New Roman" w:hAnsi="Arial Narrow"/>
-          <w:i/>
-          <w:iCs/>
-          <w:sz w:val="21"/>
-          <w:szCs w:val="21"/>
-          <w:lang w:eastAsia="es-ES"/>
-        </w:rPr>
-        <w:t>criminis</w:t>
-      </w:r>
-      <w:proofErr w:type="spellEnd"/>
-      <w:r>
-        <w:rPr>
-          <w:rFonts w:ascii="Arial Narrow" w:eastAsia="Times New Roman" w:hAnsi="Arial Narrow"/>
-          <w:sz w:val="21"/>
-          <w:szCs w:val="21"/>
-          <w:lang w:eastAsia="es-ES"/>
-        </w:rPr>
-        <w:t>” disponiendo una investigación preliminar, a nivel policial o fiscal, con la finalidad de reunir elementos, indicios y evidencias objetivas de la realización del hecho imputado, determinando que se encuadre en alguno de los tipos establecidos como delito, que se haya identificado al autor o autores del mismo, que la acción penal no haya prescrito, y que los elementos en su conjunto determinen la convicción Fiscal de que la investigación preliminar tiene suficientes elementos de cargo que revelen una causa probable para el ejercicio de la acción penal y que puedan servir de sustento a una futura acusación fiscal. También es cierto, que, si al culminar la investigación preliminar no ha podido reunirse los elementos necesarios y suficientes para el ejercicio de la acción penal, el Fiscal así lo declarará, pues dicha función entra en el marco de sus obligaciones al ser también defensor de la legalidad.</w:t>
+        <w:t>notitia criminis</w:t>
+      </w:r>
+      <w:r>
+        <w:rPr>
+          <w:rFonts w:ascii="Arial Narrow" w:eastAsia="Times New Roman" w:hAnsi="Arial Narrow"/>
+          <w:sz w:val="21"/>
+          <w:szCs w:val="21"/>
+          <w:lang w:eastAsia="es-ES"/>
+        </w:rPr>
+        <w:t xml:space="preserve">” disponiendo una investigación preliminar, a nivel policial o fiscal, con la finalidad de reunir elementos, indicios y evidencias objetivas de la realización del hecho imputado, determinando que se encuadre en alguno de los tipos establecidos como </w:t>
+      </w:r>
+      <w:r>
+        <w:rPr>
+          <w:rFonts w:ascii="Arial Narrow" w:eastAsia="Times New Roman" w:hAnsi="Arial Narrow"/>
+          <w:sz w:val="21"/>
+          <w:szCs w:val="21"/>
+          <w:lang w:eastAsia="es-ES"/>
+        </w:rPr>
+        <w:lastRenderedPageBreak/>
+        <w:t>delito, que se haya identificado al autor o autores del mismo, que la acción penal no haya prescrito, y que los elementos en su conjunto determinen la convicción Fiscal de que la investigación preliminar tiene suficientes elementos de cargo que revelen una causa probable para el ejercicio de la acción penal y que puedan servir de sustento a una futura acusación fiscal. También es cierto, que, si al culminar la investigación preliminar no ha podido reunirse los elementos necesarios y suficientes para el ejercicio de la acción penal, el Fiscal así lo declarará, pues dicha función entra en el marco de sus obligaciones al ser también defensor de la legalidad.</w:t>
       </w:r>
     </w:p>
     <w:p>
@@ -2507,7 +2235,6 @@
         </w:rPr>
         <w:t>{</w:t>
       </w:r>
-      <w:proofErr w:type="spellStart"/>
       <w:r>
         <w:rPr>
           <w:rFonts w:ascii="Arial Narrow" w:eastAsia="Times New Roman" w:hAnsi="Arial Narrow"/>
@@ -2542,17 +2269,7 @@
           <w:szCs w:val="21"/>
           <w:lang w:eastAsia="es-ES"/>
         </w:rPr>
-        <w:t>mero</w:t>
-      </w:r>
-      <w:proofErr w:type="spellEnd"/>
-      <w:r>
-        <w:rPr>
-          <w:rFonts w:ascii="Arial Narrow" w:eastAsia="Times New Roman" w:hAnsi="Arial Narrow"/>
-          <w:sz w:val="21"/>
-          <w:szCs w:val="21"/>
-          <w:lang w:eastAsia="es-ES"/>
-        </w:rPr>
-        <w:t>}</w:t>
+        <w:t>mero}</w:t>
       </w:r>
       <w:r>
         <w:rPr>
@@ -2572,7 +2289,6 @@
         </w:rPr>
         <w:t>{</w:t>
       </w:r>
-      <w:proofErr w:type="spellStart"/>
       <w:r>
         <w:rPr>
           <w:rFonts w:ascii="Arial Narrow" w:eastAsia="Times New Roman" w:hAnsi="Arial Narrow"/>
@@ -2636,7 +2352,6 @@
         </w:rPr>
         <w:t>_previa</w:t>
       </w:r>
-      <w:proofErr w:type="spellEnd"/>
       <w:r>
         <w:rPr>
           <w:rFonts w:ascii="Arial Narrow" w:eastAsia="Times New Roman" w:hAnsi="Arial Narrow"/>
@@ -2664,7 +2379,6 @@
         </w:rPr>
         <w:t>{</w:t>
       </w:r>
-      <w:proofErr w:type="spellStart"/>
       <w:r>
         <w:rPr>
           <w:rFonts w:ascii="Arial Narrow" w:eastAsia="Times New Roman" w:hAnsi="Arial Narrow"/>
@@ -2699,17 +2413,7 @@
           <w:szCs w:val="21"/>
           <w:lang w:eastAsia="es-ES"/>
         </w:rPr>
-        <w:t>investigacion</w:t>
-      </w:r>
-      <w:proofErr w:type="spellEnd"/>
-      <w:r>
-        <w:rPr>
-          <w:rFonts w:ascii="Arial Narrow" w:eastAsia="Times New Roman" w:hAnsi="Arial Narrow"/>
-          <w:sz w:val="21"/>
-          <w:szCs w:val="21"/>
-          <w:lang w:eastAsia="es-ES"/>
-        </w:rPr>
-        <w:t xml:space="preserve">} </w:t>
+        <w:t xml:space="preserve">investigacion} </w:t>
       </w:r>
       <w:r>
         <w:rPr>
@@ -2944,7 +2648,6 @@
         </w:rPr>
         <w:t>{</w:t>
       </w:r>
-      <w:proofErr w:type="spellStart"/>
       <w:r>
         <w:rPr>
           <w:rFonts w:ascii="Arial Narrow" w:eastAsia="Times New Roman" w:hAnsi="Arial Narrow"/>
@@ -2961,17 +2664,7 @@
           <w:szCs w:val="21"/>
           <w:lang w:eastAsia="es-ES"/>
         </w:rPr>
-        <w:t>ependencia_policial</w:t>
-      </w:r>
-      <w:proofErr w:type="spellEnd"/>
-      <w:r>
-        <w:rPr>
-          <w:rFonts w:ascii="Arial Narrow" w:eastAsia="Times New Roman" w:hAnsi="Arial Narrow"/>
-          <w:sz w:val="21"/>
-          <w:szCs w:val="21"/>
-          <w:lang w:eastAsia="es-ES"/>
-        </w:rPr>
-        <w:t>}</w:t>
+        <w:t>ependencia_policial}</w:t>
       </w:r>
       <w:r>
         <w:rPr>
@@ -3047,7 +2740,6 @@
         </w:rPr>
         <w:t xml:space="preserve"> {</w:t>
       </w:r>
-      <w:proofErr w:type="spellStart"/>
       <w:r>
         <w:rPr>
           <w:rFonts w:ascii="Arial Narrow" w:hAnsi="Arial Narrow"/>
@@ -3078,16 +2770,7 @@
           <w:sz w:val="21"/>
           <w:szCs w:val="21"/>
         </w:rPr>
-        <w:t>mero</w:t>
-      </w:r>
-      <w:proofErr w:type="spellEnd"/>
-      <w:r>
-        <w:rPr>
-          <w:rFonts w:ascii="Arial Narrow" w:hAnsi="Arial Narrow"/>
-          <w:sz w:val="21"/>
-          <w:szCs w:val="21"/>
-        </w:rPr>
-        <w:t>}</w:t>
+        <w:t>mero}</w:t>
       </w:r>
       <w:r>
         <w:rPr>
@@ -3384,7 +3067,6 @@
           <w:u w:val="single"/>
           <w:lang w:eastAsia="ar-SA"/>
         </w:rPr>
-        <w:lastRenderedPageBreak/>
         <w:t>PARTE DISPOSITIVA</w:t>
       </w:r>
       <w:r>
@@ -3412,6 +3094,7 @@
           <w:rFonts w:ascii="Arial Narrow" w:eastAsia="Times New Roman" w:hAnsi="Arial Narrow"/>
           <w:lang w:eastAsia="ar-SA"/>
         </w:rPr>
+        <w:lastRenderedPageBreak/>
         <w:t xml:space="preserve">Por lo expuesto </w:t>
       </w:r>
       <w:r>
@@ -3719,20 +3402,8 @@
           <w:sz w:val="16"/>
           <w:szCs w:val="16"/>
         </w:rPr>
-        <w:t>AUGF/</w:t>
-      </w:r>
-      <w:proofErr w:type="spellStart"/>
-      <w:r>
-        <w:rPr>
-          <w:rFonts w:ascii="Arial Narrow" w:hAnsi="Arial Narrow"/>
-          <w:i/>
-          <w:iCs/>
-          <w:sz w:val="16"/>
-          <w:szCs w:val="16"/>
-        </w:rPr>
-        <w:t>lgfs</w:t>
-      </w:r>
-      <w:proofErr w:type="spellEnd"/>
+        <w:t>AUGF/lgfs</w:t>
+      </w:r>
     </w:p>
     <w:bookmarkEnd w:id="0"/>
     <w:p>

</xml_diff>